<commit_message>
Update Assignment 2 documentation to match the final camera implementation
Brings §2.1, §2.7-2.8, §3.1/Table 6, §3.2/Table 7, the compliance table, and
Appendix A in line with the actual CameraRig/PaintingNarration/SitInteract
code: no third-person view, a reusable memory-focus camera with flat vs.
angled framing depending on object type, movement/look locking with an
Esc early-exit, and a seated camera with its own pan/tilt so look control
still works while sitting.
</commit_message>
<xml_diff>
--- a/Dear Anna - Assignment 2 Documentation.docx
+++ b/Dear Anna - Assignment 2 Documentation.docx
@@ -5381,7 +5381,7 @@
           <w:color w:val="2E2420"/>
           <w:sz w:val="23"/>
         </w:rPr>
-        <w:t>At any moment outside a menu, Stanislav can do eight things: walk (WASD, gravity-aware, via a CharacterController), look (mouse, yaw on the player body and pitch on the active Cinemachine camera), switch between a first-person and a third-person view (V), target whatever is dead centre of the screen (a single-pixel dot crosshair, Crosshair.cs), pick an object up and hold it for a closer look, trigger narration on an object too large or fixed to pick up, and — context-dependently — sit, sleep, toggle a light, read a letter, wind the gramophone, or write one back to Anna, a word at a time, at the typewriter. No two of these share a key by accident; the mapping is small enough that the New Input System's job here is mostly staying out of the way. (This is the general verb list; 3.1 gives the same actions as a concrete cause-and-effect table against actual world state.)</w:t>
+        <w:t>At any moment outside a menu, Stanislav can do seven things: walk (WASD, gravity-aware, via a CharacterController), look (mouse, yaw on the player body and pitch on the active Cinemachine camera), target whatever is dead centre of the screen (a single-pixel dot crosshair, Crosshair.cs), pick an object up and hold it for a closer look, trigger narration on an object too large or fixed to pick up, and — context-dependently — sit, sleep, toggle a light, read a letter, wind the gramophone, or write one back to Anna, a word at a time, at the typewriter. No two of these share a key by accident; the mapping is small enough that the New Input System's job here is mostly staying out of the way. (This is the general verb list; 3.1 gives the same actions as a concrete cause-and-effect table against actual world state.)</w:t>
       </w:r>
     </w:p>
     <w:p>
@@ -6776,14 +6776,13 @@
             </w:tcBorders>
           </w:tcPr>
           <w:p>
-            <w:r/>
             <w:r>
               <w:rPr>
                 <w:rFonts w:ascii="Garamond" w:hAnsi="Garamond" w:cs="Garamond" w:eastAsia="Garamond"/>
                 <w:color w:val="2E2420"/>
                 <w:sz w:val="20"/>
               </w:rPr>
-              <w:t>Third-person CinemachineCamera with CinemachineThirdPersonFollow</w:t>
+              <w:t>Memory-focus CinemachineCamera, blended in on gaze+E narration (CM_MemoryFocus)</w:t>
             </w:r>
           </w:p>
         </w:tc>
@@ -6799,14 +6798,13 @@
             </w:tcBorders>
           </w:tcPr>
           <w:p>
-            <w:r/>
             <w:r>
               <w:rPr>
                 <w:rFonts w:ascii="Garamond" w:hAnsi="Garamond" w:cs="Garamond" w:eastAsia="Garamond"/>
                 <w:color w:val="2E2420"/>
                 <w:sz w:val="20"/>
               </w:rPr>
-              <w:t>Pulls the camera back to show Stanislav's body and surroundings on demand.</w:t>
+              <w:t>Pushes in on whichever object is being narrated — centred for wall art, an elevated angle for desk objects — then blends back when the narration ends or Esc is pressed.</w:t>
             </w:r>
           </w:p>
         </w:tc>
@@ -6870,14 +6868,13 @@
             </w:tcBorders>
           </w:tcPr>
           <w:p>
-            <w:r/>
             <w:r>
               <w:rPr>
                 <w:rFonts w:ascii="Garamond" w:hAnsi="Garamond" w:cs="Garamond" w:eastAsia="Garamond"/>
                 <w:color w:val="2E2420"/>
                 <w:sz w:val="20"/>
               </w:rPr>
-              <w:t>V-key blend/priority transition between the two (CameraRig + CinemachineBrain)</w:t>
+              <w:t>Seated CinemachineCamera with its own pan/tilt, blended in while sitting (CM_Seated)</w:t>
             </w:r>
           </w:p>
         </w:tc>
@@ -6893,14 +6890,13 @@
             </w:tcBorders>
           </w:tcPr>
           <w:p>
-            <w:r/>
             <w:r>
               <w:rPr>
                 <w:rFonts w:ascii="Garamond" w:hAnsi="Garamond" w:cs="Garamond" w:eastAsia="Garamond"/>
                 <w:color w:val="2E2420"/>
                 <w:sz w:val="20"/>
               </w:rPr>
-              <w:t>Gives the player a smooth, instant toggle between the two views mid-session.</w:t>
+              <w:t>Eases the player's view into the chair rather than cutting to it, with mouse-look still working while seated, and back again on standing up.</w:t>
             </w:r>
           </w:p>
         </w:tc>
@@ -8521,7 +8517,7 @@
           <w:color w:val="2E2420"/>
           <w:sz w:val="23"/>
         </w:rPr>
-        <w:t>Grouped rather than listed, the eight categories tell a fairly specific story about where the implementation effort actually went. Narrative &amp; Audio is by far the largest category for a reason that should not be surprising for a game about correspondence: it is also the only category with no purely mechanical equivalent elsewhere in the table — nothing in Movement &amp; Control or Interaction &amp; Targeting does its job if the six systems in Narrative &amp; Audio are not all independently working at once, since picking up an object or pressing E is mechanically inert without something to narrate. Camera and Movement &amp; Control sit at three apiece because the brief for a first-person narrative game is almost entirely about restraint here — three mechanics each is close to the minimum that still supports a first/third-person toggle with a real blend transition, not a ceiling the prototype ran out of time to build past. Lighting holds three mechanics that do three structurally different jobs (a manual switch, a randomised runtime behaviour, and a global render-pipeline override) rather than three variations on one idea, which is why 3.3 treats them as genuinely separate systems instead of one lighting feature with settings.</w:t>
+        <w:t>Grouped rather than listed, the eight categories tell a fairly specific story about where the implementation effort actually went. Narrative &amp; Audio is by far the largest category for a reason that should not be surprising for a game about correspondence: it is also the only category with no purely mechanical equivalent elsewhere in the table — nothing in Movement &amp; Control or Interaction &amp; Targeting does its job if the six systems in Narrative &amp; Audio are not all independently working at once, since picking up an object or pressing E is mechanically inert without something to narrate. Camera and Movement &amp; Control sit at three apiece because the brief for a first-person narrative game is almost entirely about restraint here — three mechanics each is close to the minimum that still supports a real Cinemachine blend on two separate triggers (memory focus and seated) alongside the default view, not a ceiling the prototype ran out of time to build past. Lighting holds three mechanics that do three structurally different jobs (a manual switch, a randomised runtime behaviour, and a global render-pipeline override) rather than three variations on one idea, which is why 3.3 treats them as genuinely separate systems instead of one lighting feature with settings.</w:t>
       </w:r>
     </w:p>
     <w:p>
@@ -8536,7 +8532,7 @@
           <w:color w:val="2E2420"/>
           <w:sz w:val="23"/>
         </w:rPr>
-        <w:t>World &amp; Ambient is the smallest category by design, at one entry: the street's looping vehicles exist to make the room feel inhabited rather than to give the player anything new to solve, and nothing else in the game is purely ambient — even the writing desk, which could easily have been scenery, is instead where the reply-letter mechanic now sits (moved into Narrative &amp; Audio above, since composing Stanislav's reply is a narrative act, not set dressing). State &amp; Progression, at two, is a single idea (GameState's gating flags, and the one piece of furniture — the chair — whose state the player can swap directly) rather than a sprawling save/progression system, because a one-session, no-fail-state game like this one genuinely does not need more state than that to stay coherent. Transitions, at two, covers the sleep fade and the door's own animation specifically — the brief's broader cinematic-transition requirement is satisfied separately, by the V-key Cinemachine blend between first- and third-person cataloged under Camera (3.2), and the two should not be conflated.</w:t>
+        <w:t>World &amp; Ambient is the smallest category by design, at one entry: the street's looping vehicles exist to make the room feel inhabited rather than to give the player anything new to solve, and nothing else in the game is purely ambient — even the writing desk, which could easily have been scenery, is instead where the reply-letter mechanic now sits (moved into Narrative &amp; Audio above, since composing Stanislav's reply is a narrative act, not set dressing). State &amp; Progression, at two, is a single idea (GameState's gating flags, and the one piece of furniture — the chair — whose state the player can swap directly) rather than a sprawling save/progression system, because a one-session, no-fail-state game like this one genuinely does not need more state than that to stay coherent. Transitions, at two, covers the sleep fade and the door's own animation specifically — the brief's broader cinematic-transition requirement is satisfied separately, by the memory-focus and seated Cinemachine blends cataloged under Camera (3.2), and the two should not be conflated.</w:t>
       </w:r>
     </w:p>
     <w:p>
@@ -8597,7 +8593,7 @@
           <w:color w:val="2E2420"/>
           <w:sz w:val="23"/>
         </w:rPr>
-        <w:t>GameState's three flags are worth tracing through a full lifecycle rather than just naming, since between them they are what makes the walkthrough in 1.8 possible without a single scripted cutscene forcing it. AnnaLetterRead starts false and is set permanently true the moment GameIntro's letter sequence finishes — permanently, because nothing in the game ever has a reason to make Stanislav un-read something. SleepInteract reads that flag every frame before it will even check whether the player is looking at the bed, which is a cheaper and more honest gate than disabling the bed's collider outright: the bed is always physically there, it simply has nothing to say yet. IsDreaming flips true inside SleepInteract's own coroutine, after the fade-out and the hold-on-black but before the fade back in, and nothing currently reads it back except as a semantic marker for future work (Appendix B) — a deliberate seam left in the state machine rather than an oversight. IsUIOpen is the busiest flag by far: every interactive script — SleepInteract, InspectableObject, PaintingNarration, LightSwitch, SitInteract, the camera rig's own V-key toggle — checks it before acting, and the letter-reader, the sleep sequence, and any held-object inspection all set it true for their own duration and restore it false afterward. The result is a single shared switch that keeps exactly one foreground interaction active at a time, without any of those systems needing to know the others exist.</w:t>
+        <w:t>GameState's three flags are worth tracing through a full lifecycle rather than just naming, since between them they are what makes the walkthrough in 1.8 possible without a single scripted cutscene forcing it. AnnaLetterRead starts false and is set permanently true the moment GameIntro's letter sequence finishes — permanently, because nothing in the game ever has a reason to make Stanislav un-read something. SleepInteract reads that flag every frame before it will even check whether the player is looking at the bed, which is a cheaper and more honest gate than disabling the bed's collider outright: the bed is always physically there, it simply has nothing to say yet. IsDreaming flips true inside SleepInteract's own coroutine, after the fade-out and the hold-on-black but before the fade back in, and nothing currently reads it back except as a semantic marker for future work (Appendix B) — a deliberate seam left in the state machine rather than an oversight. IsUIOpen is the busiest flag by far: every interactive script — SleepInteract, InspectableObject, PaintingNarration, LightSwitch, SitInteract — checks it before acting, and the letter-reader, the sleep sequence, any held-object inspection, and a memory-focus narration shot all set it true for their own duration and restore it false afterward. The result is a single shared switch that keeps exactly one foreground interaction active at a time, without any of those systems needing to know the others exist.</w:t>
       </w:r>
     </w:p>
     <w:p>
@@ -9377,14 +9373,13 @@
             </w:tcBorders>
           </w:tcPr>
           <w:p>
-            <w:r/>
             <w:r>
               <w:rPr>
                 <w:rFonts w:ascii="Garamond" w:hAnsi="Garamond" w:cs="Garamond" w:eastAsia="Garamond"/>
                 <w:color w:val="2E2420"/>
                 <w:sz w:val="20"/>
               </w:rPr>
-              <w:t>Player position and rotation swap to a seated pose; pressing E stands the player back up (SitInteract).</w:t>
+              <w:t>Player position and rotation swap to a seated pose; the camera blends into the seated vantage (CM_Seated, 3.2), which keeps its own look control; pressing E stands the player back up and blends the camera back (SitInteract).</w:t>
             </w:r>
           </w:p>
         </w:tc>
@@ -9519,14 +9514,13 @@
             </w:tcBorders>
           </w:tcPr>
           <w:p>
-            <w:r/>
             <w:r>
               <w:rPr>
                 <w:rFonts w:ascii="Garamond" w:hAnsi="Garamond" w:cs="Garamond" w:eastAsia="Garamond"/>
                 <w:color w:val="2E2420"/>
                 <w:sz w:val="20"/>
               </w:rPr>
-              <w:t>On-screen narration text (and, where recorded, a voice clip) displays for a fixed duration; GameState.IsUIOpen is held true for that duration (PaintingNarration).</w:t>
+              <w:t>On-screen narration text (and, where recorded, a voice clip) displays for a fixed duration; the camera blends into a framed shot of the object (CM_MemoryFocus, 3.2), locking movement and look for the duration; GameState.IsUIOpen is held true, and Esc cancels early (PaintingNarration).</w:t>
             </w:r>
           </w:p>
         </w:tc>
@@ -9636,7 +9630,7 @@
           <w:color w:val="2E2420"/>
           <w:sz w:val="23"/>
         </w:rPr>
-        <w:t>Camera work in “Dear Anna” went through one significant revision during development: an early hand-rolled first-person controller that computed pitch and yaw directly on the camera transform was replaced wholesale with a Cinemachine rig, specifically so the brief's camera-transition requirement would be satisfied by Cinemachine's own blending system rather than a bespoke animation. Table 7 lists the three resulting camera behaviours at a glance; the rest of this section describes how each is built.</w:t>
+        <w:t>Camera work in “Dear Anna” is built entirely on Cinemachine, specifically so every transition between views is a real blend rather than a cut. The brief's own camera-behaviour requirement lists first-person, third-person, and a blending/priority transition as examples of what counts, not a fixed checklist — this project implements three distinct behaviours chosen to fit a slow, first-person memory game rather than to tick off every example literally. There is no third-person view: nothing in “Dear Anna” is ever meant to be seen from outside Stanislav, so a behaviour that exists only to show his own body from a distance has no place in it. Table 7 lists the three actual behaviours; the rest of this section describes how each is built.</w:t>
       </w:r>
     </w:p>
     <w:p>
@@ -9817,14 +9811,13 @@
             </w:tcBorders>
           </w:tcPr>
           <w:p>
-            <w:r/>
             <w:r>
               <w:rPr>
                 <w:rFonts w:ascii="Garamond" w:hAnsi="Garamond" w:cs="Garamond" w:eastAsia="Garamond"/>
                 <w:color w:val="2E2420"/>
                 <w:sz w:val="20"/>
               </w:rPr>
-              <w:t>Third-person</w:t>
+              <w:t>Memory focus</w:t>
             </w:r>
           </w:p>
         </w:tc>
@@ -9840,14 +9833,13 @@
             </w:tcBorders>
           </w:tcPr>
           <w:p>
-            <w:r/>
             <w:r>
               <w:rPr>
                 <w:rFonts w:ascii="Garamond" w:hAnsi="Garamond" w:cs="Garamond" w:eastAsia="Garamond"/>
                 <w:color w:val="2E2420"/>
                 <w:sz w:val="20"/>
               </w:rPr>
-              <w:t>CM_ThirdPerson (CinemachineCamera + CinemachineThirdPersonFollow)</w:t>
+              <w:t>CM_MemoryFocus (CinemachineCamera, transform-driven)</w:t>
             </w:r>
           </w:p>
         </w:tc>
@@ -9863,14 +9855,13 @@
             </w:tcBorders>
           </w:tcPr>
           <w:p>
-            <w:r/>
             <w:r>
               <w:rPr>
                 <w:rFonts w:ascii="Garamond" w:hAnsi="Garamond" w:cs="Garamond" w:eastAsia="Garamond"/>
                 <w:color w:val="2E2420"/>
                 <w:sz w:val="20"/>
               </w:rPr>
-              <w:t>Over-the-shoulder framing with a CinemachineRotationComposer keeping the player in view.</w:t>
+              <w:t>A one-shot framed shot on whichever object is being narrated, locking movement and look; blends in on E, blends back out when the narration ends or Esc is pressed.</w:t>
             </w:r>
           </w:p>
         </w:tc>
@@ -9888,14 +9879,13 @@
             </w:tcBorders>
           </w:tcPr>
           <w:p>
-            <w:r/>
             <w:r>
               <w:rPr>
                 <w:rFonts w:ascii="Garamond" w:hAnsi="Garamond" w:cs="Garamond" w:eastAsia="Garamond"/>
                 <w:color w:val="2E2420"/>
                 <w:sz w:val="20"/>
               </w:rPr>
-              <w:t>V-key transition</w:t>
+              <w:t>Seated</w:t>
             </w:r>
           </w:p>
         </w:tc>
@@ -9911,14 +9901,13 @@
             </w:tcBorders>
           </w:tcPr>
           <w:p>
-            <w:r/>
             <w:r>
               <w:rPr>
                 <w:rFonts w:ascii="Garamond" w:hAnsi="Garamond" w:cs="Garamond" w:eastAsia="Garamond"/>
                 <w:color w:val="2E2420"/>
                 <w:sz w:val="20"/>
               </w:rPr>
-              <w:t>CameraRig + CinemachineBrain</w:t>
+              <w:t>CM_Seated (CinemachineCamera + CinemachinePanTilt)</w:t>
             </w:r>
           </w:p>
         </w:tc>
@@ -9934,14 +9923,13 @@
             </w:tcBorders>
           </w:tcPr>
           <w:p>
-            <w:r/>
             <w:r>
               <w:rPr>
                 <w:rFonts w:ascii="Garamond" w:hAnsi="Garamond" w:cs="Garamond" w:eastAsia="Garamond"/>
                 <w:color w:val="2E2420"/>
                 <w:sz w:val="20"/>
               </w:rPr>
-              <w:t>Swaps which camera is enabled; CinemachineBrain blends between them live rather than cutting.</w:t>
+              <w:t>Eases the view into the chair when the player sits, instead of cutting, and keeps mouse-look working while seated.</w:t>
             </w:r>
           </w:p>
         </w:tc>
@@ -9964,7 +9952,7 @@
           <w:color w:val="2E2420"/>
           <w:sz w:val="23"/>
         </w:rPr>
-        <w:t>The rig (CameraRig.cs, on the Player object) owns both CinemachineCamera instances. CM_FirstPerson is a child of the player, carrying a CinemachinePanTilt for vertical look, driven by a small adapter script (CinemachineLookInput) that reads mouse delta and clamps pitch to ±80°; FirstPersonMove.cs itself now only turns the player body on the horizontal axis, since vertical look belongs entirely to Cinemachine. CM_ThirdPerson sits at the root of the scene and uses CinemachineThirdPersonFollow for an over-the-shoulder framing, with a CinemachineRotationComposer keeping the player in frame as they turn. Pressing V flips which of the two is enabled; CinemachineBrain, on the main camera, smoothly blends between whichever camera currently holds priority rather than cutting — precisely the “transition using Cinemachine's camera-switching behaviour” the brief asks for, with no separate cutscene camera required to satisfy it.</w:t>
+        <w:t>CameraRig.cs (on the Player object) owns all three CinemachineCamera instances and switches which one is enabled — the same mechanism every time, since CinemachineBrain, on the main camera, blends smoothly between whichever camera currently holds priority rather than cutting. CM_FirstPerson and CM_Seated are both children of the player, each carrying its own CinemachinePanTilt and CinemachineLookInput adapter for vertical look, so mouse-look works identically in both — standing or seated, the player can look around freely, and CM_Seated inherits the same horizontal yaw the player's own body rotation already drives through the ordinary parent-child transform relationship; FirstPersonMove.cs itself only ever turns the player body on the horizontal axis. CM_MemoryFocus is the one camera that isn't parented or steered by a look component at all: it's a bare, transform-driven CinemachineCamera that PaintingNarration repositions directly each time a gaze+E narration starts, framed one of two ways depending on what kind of object it is — a straight-on, centred shot along the object's own forward axis for flat, wall-mounted art (paintings, photographs, the portrait, the clock), or an elevated three-quarter shot, pulled back and lifted above the object, for anything freestanding on a surface (the inkwell and paper, the chess set, the safe, the flowers), derived from whichever side of the object the player is actually standing on rather than the object's own orientation. One memory-focus camera is reused across all seventeen narrated objects this way, repositioned fresh each time, rather than built once per object. Movement and look are frozen for the length of a focus shot (fpm.canMove/canLook) and GameState.IsUIOpen is held true, so the player can't drift out of frame while it's holding; pressing Esc cancels early and blends straight back to first-person, with an on-screen prompt confirming the option. Sitting down at the writing desk works the same way in reverse: movement locks (the player doesn't walk from a chair) but look does not, which is what lets a seated player look down at the typewriter rather than staring at a fixed point.</w:t>
       </w:r>
     </w:p>
     <w:p>
@@ -9979,7 +9967,7 @@
           <w:color w:val="2E2420"/>
           <w:sz w:val="23"/>
         </w:rPr>
-        <w:t>Both cameras originally inherited Cinemachine's default 40° field of view, which turned out to cause two separate problems at once: visually, the view read as unnaturally narrow and zoomed in; functionally, InspectableObject's hand-held framing math (FrameHeldObject) reads the active camera's field of view directly to size a picked-up object against the screen, so the same narrow lens that looked wrong was also actively breaking the fit calculation for anything the player picked up. Figure 7 shows why — the same object, at the same distance, fills far more of a 40° frame than a 75° one. Both cameras are now set to a 75° field of view, which reads as a natural first-person lens and restores the inspection framing to working order.</w:t>
+        <w:t>All three cameras originally inherited Cinemachine's default 40° field of view, which turned out to cause two separate problems at once: visually, the view read as unnaturally narrow and zoomed in; functionally, InspectableObject's hand-held framing math (FrameHeldObject) reads the active camera's field of view directly to size a picked-up object against the screen, so the same narrow lens that looked wrong was also actively breaking the fit calculation for anything the player picked up. Figure 7 shows why — the same object, at the same distance, fills far more of a 40° frame than a 75° one. All three cameras are now set to a 75° field of view, which reads as a natural first-person lens and restores the inspection framing to working order.</w:t>
       </w:r>
     </w:p>
     <w:p>
@@ -11750,14 +11738,13 @@
             </w:tcBorders>
           </w:tcPr>
           <w:p>
-            <w:r/>
             <w:r>
               <w:rPr>
                 <w:rFonts w:ascii="Garamond" w:hAnsi="Garamond" w:cs="Garamond" w:eastAsia="Garamond"/>
                 <w:color w:val="2E2420"/>
                 <w:sz w:val="20"/>
               </w:rPr>
-              <w:t>3 / 3 ✓ — first-person, third-person, live blend transition</w:t>
+              <w:t>3 / 3 ✓ — first-person, memory-focus blend, seated blend</w:t>
             </w:r>
           </w:p>
         </w:tc>
@@ -11945,7 +11932,7 @@
           <w:color w:val="2E2420"/>
           <w:sz w:val="23"/>
         </w:rPr>
-        <w:t>A few rows are worth a sentence of self-assessment rather than a bare checkmark. The object count clears the threshold on named, interactive objects alone, without counting the nine further silent flower pots (1.6) toward it — thirty-one objects a player can pick up, look at, or operate, against a world of two bounded rooms, which is a dense object-to-room ratio by design, since an epistolary game's whole argument depends on the room rewarding close attention rather than quick traversal. The lighting row is the one this document is most confident about: the three behaviours in Table 8 are not three settings on one system but three structurally unrelated ones — a UI-driven toggle, a randomised runtime behaviour, and a render-pipeline-level override — and 3.3 describes the third one as what it technically is rather than arguing for why it should count. The camera row is the one most worth reading 3.2 in full for rather than taking the table's word on: the brief's own example language is “switch between virtual cameras,” and that is a literal, not approximate, description of what the V key does.</w:t>
+        <w:t>A few rows are worth a sentence of self-assessment rather than a bare checkmark. The object count clears the threshold on named, interactive objects alone, without counting the nine further silent flower pots (1.6) toward it — thirty-one objects a player can pick up, look at, or operate, against a world of two bounded rooms, which is a dense object-to-room ratio by design, since an epistolary game's whole argument depends on the room rewarding close attention rather than quick traversal. The lighting row is the one this document is most confident about: the three behaviours in Table 8 are not three settings on one system but three structurally unrelated ones — a UI-driven toggle, a randomised runtime behaviour, and a render-pipeline-level override — and 3.3 describes the third one as what it technically is rather than arguing for why it should count. The camera row is the one most worth reading 3.2 in full for rather than taking the table's word on: the brief's own example language is “switch between virtual cameras” and “zoom on interaction,” and CameraRig's enable/disable swap between CM_FirstPerson, CM_MemoryFocus, and CM_Seated is a literal, not approximate, description of the first, with the memory-focus camera itself being a literal instance of the second.</w:t>
       </w:r>
     </w:p>
     <w:p>
@@ -12172,14 +12159,13 @@
             </w:tcBorders>
           </w:tcPr>
           <w:p>
-            <w:r/>
             <w:r>
               <w:rPr>
                 <w:rFonts w:ascii="Garamond" w:hAnsi="Garamond" w:cs="Garamond" w:eastAsia="Garamond"/>
                 <w:color w:val="2E2420"/>
                 <w:sz w:val="20"/>
               </w:rPr>
-              <w:t>Owns the first/third-person CinemachineCameras and the V-key swap (§3.2)</w:t>
+              <w:t>Owns the first-person, memory-focus, and seated CinemachineCameras and switches which is live (§3.2)</w:t>
             </w:r>
           </w:p>
         </w:tc>
@@ -12364,14 +12350,13 @@
             </w:tcBorders>
           </w:tcPr>
           <w:p>
-            <w:r/>
             <w:r>
               <w:rPr>
                 <w:rFonts w:ascii="Garamond" w:hAnsi="Garamond" w:cs="Garamond" w:eastAsia="Garamond"/>
                 <w:color w:val="2E2420"/>
                 <w:sz w:val="20"/>
               </w:rPr>
-              <w:t>Gaze-and-confirm narration, with occlusion checking (§2.8, §3.4)</w:t>
+              <w:t>Gaze-and-confirm narration, with occlusion checking and the memory-focus camera trigger (§2.8, §3.2, §3.4)</w:t>
             </w:r>
           </w:p>
         </w:tc>

</xml_diff>